<commit_message>
Finalize FreshCtx v0.1.0 release contract
</commit_message>
<xml_diff>
--- a/docs/FreshCtx_One_Page_Brief.docx
+++ b/docs/FreshCtx_One_Page_Brief.docx
@@ -35,13 +35,7 @@
         <w:spacing w:after="100"/>
       </w:pPr>
       <w:r>
-        <w:rPr>
-          <w:rFonts w:ascii="Aptos Display" w:hAnsi="Aptos Display"/>
-          <w:b/>
-          <w:color w:val="145DA0"/>
-          <w:sz w:val="25"/>
-        </w:rPr>
-        <w:t>Never let an AI agent reason or act on stale reality</w:t>
+        <w:t>Don't let AI agents act on stale reasoning.</w:t>
       </w:r>
     </w:p>
     <w:tbl>
@@ -79,14 +73,7 @@
               <w:spacing w:after="0"/>
             </w:pPr>
             <w:r>
-              <w:rPr>
-                <w:b/>
-                <w:color w:val="007880"/>
-              </w:rPr>
-              <w:t xml:space="preserve">Purpose  </w:t>
-            </w:r>
-            <w:r>
-              <w:t>A lightweight freshness layer that prevents agents from silently relying on changed sources or invalidated reasoning.</w:t>
+              <w:t>Purpose  A runtime freshness guard that revalidates declared evidence and invalidates affected reasoning before an AI-supported action executes.</w:t>
             </w:r>
           </w:p>
         </w:tc>
@@ -147,7 +134,7 @@
         <w:spacing w:after="40"/>
       </w:pPr>
       <w:r>
-        <w:t>FreshCtx records what was observed, links derived reasoning to those observations, and checks validity at the moment an agent reasons or acts.</w:t>
+        <w:t>FreshCtx fingerprints declared evidence, links dependent reasoning to those observations, and revalidates reachable dependencies immediately before a protected action or output.</w:t>
       </w:r>
     </w:p>
     <w:p>
@@ -311,15 +298,8 @@
             <w:vAlign w:val="center"/>
           </w:tcPr>
           <w:p>
-            <w:pPr>
-              <w:spacing w:after="0"/>
-              <w:jc w:val="center"/>
-            </w:pPr>
             <w:r>
-              <w:rPr>
-                <w:sz w:val="14"/>
-              </w:rPr>
-              <w:t>Inputs and reasoning remain valid.</w:t>
+              <w:t>All reachable declared dependencies revalidated as equivalent at check time.</w:t>
             </w:r>
           </w:p>
         </w:tc>
@@ -515,7 +495,7 @@
         <w:ind w:left="288" w:hanging="173"/>
       </w:pPr>
       <w:r>
-        <w:t>Does not guarantee factual correctness; it verifies whether evidence and dependent reasoning are still current.</w:t>
+        <w:t>CURRENT proves only configured-adapter equivalence for reachable declared dependencies at check time. It does not prove truth, logical correctness, authorization, safety, compliance, or global reality.</w:t>
       </w:r>
     </w:p>
     <w:p>
@@ -532,7 +512,7 @@
         <w:spacing w:after="40"/>
       </w:pPr>
       <w:r>
-        <w:t>Apache-2.0; model- and framework-neutral; local-first; no account or telemetry required. Unlike S-Bus, FreshCtx instruments heterogeneous tools and sources already in use rather than owning or centralizing application state.</w:t>
+        <w:t>Owned and stewarded by Hyperwise LLC; Apache-2.0; model- and framework-neutral; local-first; no account or telemetry required. FreshCtx validates heterogeneous declared sources without centralizing application state.</w:t>
       </w:r>
     </w:p>
     <w:tbl>
@@ -570,17 +550,7 @@
               <w:spacing w:after="0"/>
             </w:pPr>
             <w:r>
-              <w:rPr>
-                <w:b/>
-                <w:color w:val="007880"/>
-              </w:rPr>
-              <w:t xml:space="preserve">Launch thesis  </w:t>
-            </w:r>
-            <w:r>
-              <w:rPr>
-                <w:b/>
-              </w:rPr>
-              <w:t>Memory tells an AI what it knew. FreshCtx tells it whether what it knew is still current.</w:t>
+              <w:t>Category  FreshCtx is dependency validation and reasoning-drift control, not memory, context capture, session restoration, or model portability.</w:t>
             </w:r>
           </w:p>
         </w:tc>

</xml_diff>